<commit_message>
Fragen angepasst, player hinzugefügt
</commit_message>
<xml_diff>
--- a/Arbeit/Interview/Vorbereitung/Durchführung.docx
+++ b/Arbeit/Interview/Vorbereitung/Durchführung.docx
@@ -4,6 +4,7 @@
   <w:body>
     <w:p>
       <w:pPr>
+        <w:spacing w:line="264" w:lineRule="auto"/>
         <w:rPr>
           <w:rFonts w:ascii="Verdana" w:hAnsi="Verdana"/>
           <w:sz w:val="40"/>
@@ -21,26 +22,28 @@
     </w:p>
     <w:p>
       <w:pPr>
-        <w:rPr>
-          <w:rFonts w:ascii="Verdana" w:hAnsi="Verdana"/>
-          <w:sz w:val="22"/>
-          <w:szCs w:val="22"/>
-        </w:rPr>
-      </w:pPr>
-    </w:p>
-    <w:p>
-      <w:pPr>
-        <w:rPr>
-          <w:rFonts w:ascii="Verdana" w:hAnsi="Verdana"/>
-          <w:sz w:val="22"/>
-          <w:szCs w:val="22"/>
-        </w:rPr>
-      </w:pPr>
-      <w:r>
-        <w:rPr>
-          <w:rFonts w:ascii="Verdana" w:hAnsi="Verdana"/>
-          <w:sz w:val="22"/>
-          <w:szCs w:val="22"/>
+        <w:spacing w:line="264" w:lineRule="auto"/>
+        <w:rPr>
+          <w:rFonts w:ascii="Verdana" w:hAnsi="Verdana"/>
+          <w:sz w:val="22"/>
+          <w:szCs w:val="22"/>
+        </w:rPr>
+      </w:pPr>
+    </w:p>
+    <w:p>
+      <w:pPr>
+        <w:spacing w:line="264" w:lineRule="auto"/>
+        <w:rPr>
+          <w:rFonts w:ascii="Verdana" w:hAnsi="Verdana"/>
+          <w:sz w:val="28"/>
+          <w:szCs w:val="28"/>
+        </w:rPr>
+      </w:pPr>
+      <w:r>
+        <w:rPr>
+          <w:rFonts w:ascii="Verdana" w:hAnsi="Verdana"/>
+          <w:sz w:val="28"/>
+          <w:szCs w:val="28"/>
           <w:u w:val="single"/>
         </w:rPr>
         <w:t>Zielsetzung</w:t>
@@ -48,25 +51,16 @@
       <w:r>
         <w:rPr>
           <w:rFonts w:ascii="Verdana" w:hAnsi="Verdana"/>
-          <w:sz w:val="22"/>
-          <w:szCs w:val="22"/>
+          <w:sz w:val="28"/>
+          <w:szCs w:val="28"/>
         </w:rPr>
         <w:t>:</w:t>
       </w:r>
     </w:p>
     <w:p>
       <w:pPr>
-        <w:rPr>
-          <w:rFonts w:ascii="Verdana" w:hAnsi="Verdana"/>
-          <w:sz w:val="22"/>
-          <w:szCs w:val="22"/>
-        </w:rPr>
-      </w:pPr>
-    </w:p>
-    <w:p>
-      <w:pPr>
-        <w:pStyle w:val="p1"/>
-        <w:spacing w:before="0" w:beforeAutospacing="0" w:after="0" w:afterAutospacing="0" w:line="276" w:lineRule="auto"/>
+        <w:pStyle w:val="p1"/>
+        <w:spacing w:before="240" w:beforeAutospacing="0" w:after="0" w:afterAutospacing="0" w:line="264" w:lineRule="auto"/>
         <w:jc w:val="both"/>
         <w:rPr>
           <w:rFonts w:ascii="Verdana" w:hAnsi="Verdana"/>
@@ -86,59 +80,24 @@
     <w:p>
       <w:pPr>
         <w:pStyle w:val="p1"/>
-        <w:spacing w:before="0" w:beforeAutospacing="0" w:after="0" w:afterAutospacing="0" w:line="276" w:lineRule="auto"/>
-        <w:jc w:val="both"/>
-        <w:rPr>
-          <w:rFonts w:ascii="Verdana" w:hAnsi="Verdana"/>
-          <w:sz w:val="22"/>
-          <w:szCs w:val="22"/>
+        <w:spacing w:before="240" w:beforeAutospacing="0" w:after="0" w:afterAutospacing="0" w:line="264" w:lineRule="auto"/>
+        <w:jc w:val="both"/>
+        <w:rPr>
+          <w:rFonts w:ascii="Verdana" w:hAnsi="Verdana"/>
+          <w:sz w:val="28"/>
+          <w:szCs w:val="28"/>
           <w:u w:val="single"/>
         </w:rPr>
       </w:pPr>
-    </w:p>
-    <w:p>
-      <w:pPr>
-        <w:pStyle w:val="p1"/>
-        <w:spacing w:before="0" w:beforeAutospacing="0" w:after="0" w:afterAutospacing="0" w:line="276" w:lineRule="auto"/>
-        <w:jc w:val="both"/>
-        <w:rPr>
-          <w:rFonts w:ascii="Verdana" w:hAnsi="Verdana"/>
-          <w:sz w:val="22"/>
-          <w:szCs w:val="22"/>
+      <w:r>
+        <w:rPr>
+          <w:rFonts w:ascii="Verdana" w:hAnsi="Verdana"/>
+          <w:sz w:val="28"/>
+          <w:szCs w:val="28"/>
           <w:u w:val="single"/>
         </w:rPr>
-      </w:pPr>
-      <w:r>
-        <w:rPr>
-          <w:rFonts w:ascii="Verdana" w:hAnsi="Verdana"/>
-          <w:sz w:val="22"/>
-          <w:szCs w:val="22"/>
-          <w:u w:val="single"/>
-        </w:rPr>
-        <w:t>Struktur</w:t>
-      </w:r>
-      <w:r>
-        <w:rPr>
-          <w:rFonts w:ascii="Verdana" w:hAnsi="Verdana"/>
-          <w:sz w:val="22"/>
-          <w:szCs w:val="22"/>
-          <w:u w:val="single"/>
-        </w:rPr>
-        <w:t>:</w:t>
-      </w:r>
-    </w:p>
-    <w:p>
-      <w:pPr>
-        <w:pStyle w:val="p1"/>
-        <w:spacing w:before="0" w:beforeAutospacing="0" w:after="0" w:afterAutospacing="0" w:line="276" w:lineRule="auto"/>
-        <w:jc w:val="both"/>
-        <w:rPr>
-          <w:rFonts w:ascii="Verdana" w:hAnsi="Verdana"/>
-          <w:sz w:val="22"/>
-          <w:szCs w:val="22"/>
-          <w:u w:val="single"/>
-        </w:rPr>
-      </w:pPr>
+        <w:t>Struktur:</w:t>
+      </w:r>
     </w:p>
     <w:p>
       <w:pPr>
@@ -147,7 +106,7 @@
           <w:ilvl w:val="0"/>
           <w:numId w:val="1"/>
         </w:numPr>
-        <w:spacing w:before="0" w:beforeAutospacing="0" w:after="0" w:afterAutospacing="0" w:line="276" w:lineRule="auto"/>
+        <w:spacing w:before="240" w:beforeAutospacing="0" w:after="0" w:afterAutospacing="0" w:line="264" w:lineRule="auto"/>
         <w:jc w:val="both"/>
         <w:rPr>
           <w:rFonts w:ascii="Verdana" w:hAnsi="Verdana"/>
@@ -179,7 +138,7 @@
           <w:ilvl w:val="0"/>
           <w:numId w:val="1"/>
         </w:numPr>
-        <w:spacing w:before="0" w:beforeAutospacing="0" w:after="0" w:afterAutospacing="0" w:line="276" w:lineRule="auto"/>
+        <w:spacing w:before="0" w:beforeAutospacing="0" w:after="0" w:afterAutospacing="0" w:line="264" w:lineRule="auto"/>
         <w:jc w:val="both"/>
         <w:rPr>
           <w:rFonts w:ascii="Verdana" w:hAnsi="Verdana"/>
@@ -203,7 +162,7 @@
           <w:ilvl w:val="0"/>
           <w:numId w:val="1"/>
         </w:numPr>
-        <w:spacing w:before="0" w:beforeAutospacing="0" w:after="0" w:afterAutospacing="0" w:line="276" w:lineRule="auto"/>
+        <w:spacing w:before="0" w:beforeAutospacing="0" w:after="0" w:afterAutospacing="0" w:line="264" w:lineRule="auto"/>
         <w:jc w:val="both"/>
         <w:rPr>
           <w:rFonts w:ascii="Verdana" w:hAnsi="Verdana"/>
@@ -227,7 +186,7 @@
           <w:ilvl w:val="0"/>
           <w:numId w:val="1"/>
         </w:numPr>
-        <w:spacing w:before="0" w:beforeAutospacing="0" w:after="0" w:afterAutospacing="0" w:line="276" w:lineRule="auto"/>
+        <w:spacing w:before="0" w:beforeAutospacing="0" w:after="0" w:afterAutospacing="0" w:line="264" w:lineRule="auto"/>
         <w:jc w:val="both"/>
         <w:rPr>
           <w:rFonts w:ascii="Verdana" w:hAnsi="Verdana"/>
@@ -251,67 +210,800 @@
           <w:ilvl w:val="0"/>
           <w:numId w:val="1"/>
         </w:numPr>
+        <w:spacing w:before="0" w:beforeAutospacing="0" w:after="0" w:afterAutospacing="0" w:line="264" w:lineRule="auto"/>
+        <w:jc w:val="both"/>
+        <w:rPr>
+          <w:rFonts w:ascii="Verdana" w:hAnsi="Verdana"/>
+          <w:sz w:val="22"/>
+          <w:szCs w:val="22"/>
+        </w:rPr>
+      </w:pPr>
+      <w:r>
+        <w:rPr>
+          <w:rFonts w:ascii="Verdana" w:hAnsi="Verdana"/>
+          <w:sz w:val="22"/>
+          <w:szCs w:val="22"/>
+        </w:rPr>
+        <w:t>Abschluss &amp; Einverständniserklärung</w:t>
+      </w:r>
+    </w:p>
+    <w:p>
+      <w:pPr>
+        <w:pStyle w:val="p1"/>
+        <w:spacing w:before="240" w:beforeAutospacing="0" w:after="0" w:afterAutospacing="0" w:line="264" w:lineRule="auto"/>
+        <w:jc w:val="both"/>
+        <w:rPr>
+          <w:rFonts w:ascii="Verdana" w:hAnsi="Verdana"/>
+          <w:sz w:val="28"/>
+          <w:szCs w:val="28"/>
+          <w:u w:val="single"/>
+        </w:rPr>
+      </w:pPr>
+      <w:r>
+        <w:rPr>
+          <w:rFonts w:ascii="Verdana" w:hAnsi="Verdana"/>
+          <w:sz w:val="28"/>
+          <w:szCs w:val="28"/>
+          <w:u w:val="single"/>
+        </w:rPr>
+        <w:t>Fragen:</w:t>
+      </w:r>
+    </w:p>
+    <w:p>
+      <w:pPr>
+        <w:pStyle w:val="p1"/>
+        <w:numPr>
+          <w:ilvl w:val="0"/>
+          <w:numId w:val="2"/>
+        </w:numPr>
+        <w:spacing w:before="240" w:beforeAutospacing="0" w:after="0" w:afterAutospacing="0" w:line="264" w:lineRule="auto"/>
+        <w:jc w:val="both"/>
+        <w:rPr>
+          <w:rFonts w:ascii="Verdana" w:hAnsi="Verdana"/>
+          <w:sz w:val="22"/>
+          <w:szCs w:val="22"/>
+        </w:rPr>
+      </w:pPr>
+      <w:r>
+        <w:rPr>
+          <w:rFonts w:ascii="Verdana" w:hAnsi="Verdana"/>
+          <w:i/>
+          <w:iCs/>
+          <w:sz w:val="22"/>
+          <w:szCs w:val="22"/>
+        </w:rPr>
+        <w:t>Einstieg</w:t>
+      </w:r>
+      <w:r>
+        <w:rPr>
+          <w:rFonts w:ascii="Verdana" w:hAnsi="Verdana"/>
+          <w:sz w:val="22"/>
+          <w:szCs w:val="22"/>
+        </w:rPr>
+        <w:t xml:space="preserve">: </w:t>
+      </w:r>
+    </w:p>
+    <w:p>
+      <w:pPr>
+        <w:pStyle w:val="p1"/>
+        <w:spacing w:before="240" w:beforeAutospacing="0" w:after="0" w:afterAutospacing="0" w:line="264" w:lineRule="auto"/>
+        <w:ind w:left="708"/>
+        <w:jc w:val="both"/>
+        <w:rPr>
+          <w:rFonts w:ascii="Verdana" w:hAnsi="Verdana"/>
+          <w:sz w:val="22"/>
+          <w:szCs w:val="22"/>
+        </w:rPr>
+      </w:pPr>
+      <w:r>
+        <w:rPr>
+          <w:rFonts w:ascii="Verdana" w:hAnsi="Verdana"/>
+          <w:sz w:val="22"/>
+          <w:szCs w:val="22"/>
+        </w:rPr>
+        <w:t>Können Sie kurz beschreiben, welche Rolle Sie derzeit in der Lehre der objektorientierten Programmierung an der HTWK Leipzig einnehmen?</w:t>
+      </w:r>
+    </w:p>
+    <w:p>
+      <w:pPr>
+        <w:pStyle w:val="p1"/>
+        <w:spacing w:before="240" w:beforeAutospacing="0" w:after="0" w:afterAutospacing="0" w:line="264" w:lineRule="auto"/>
+        <w:ind w:left="708"/>
+        <w:jc w:val="both"/>
+        <w:rPr>
+          <w:rFonts w:ascii="Verdana" w:hAnsi="Verdana"/>
+          <w:sz w:val="22"/>
+          <w:szCs w:val="22"/>
+        </w:rPr>
+      </w:pPr>
+      <w:r>
+        <w:rPr>
+          <w:rFonts w:ascii="Verdana" w:hAnsi="Verdana"/>
+          <w:sz w:val="22"/>
+          <w:szCs w:val="22"/>
+        </w:rPr>
+        <w:t>Welche Herausforderungen beobachten Sie bei der Vermittlung objektorientierter Programmier</w:t>
+      </w:r>
+      <w:r>
+        <w:rPr>
+          <w:rFonts w:ascii="Verdana" w:hAnsi="Verdana"/>
+          <w:sz w:val="22"/>
+          <w:szCs w:val="22"/>
+        </w:rPr>
+        <w:t>konzepte</w:t>
+      </w:r>
+      <w:r>
+        <w:rPr>
+          <w:rFonts w:ascii="Verdana" w:hAnsi="Verdana"/>
+          <w:sz w:val="22"/>
+          <w:szCs w:val="22"/>
+        </w:rPr>
+        <w:t xml:space="preserve"> besonders häufig</w:t>
+      </w:r>
+      <w:r>
+        <w:rPr>
+          <w:rFonts w:ascii="Verdana" w:hAnsi="Verdana"/>
+          <w:sz w:val="22"/>
+          <w:szCs w:val="22"/>
+        </w:rPr>
+        <w:t>?</w:t>
+      </w:r>
+    </w:p>
+    <w:p>
+      <w:pPr>
+        <w:pStyle w:val="p1"/>
+        <w:numPr>
+          <w:ilvl w:val="0"/>
+          <w:numId w:val="2"/>
+        </w:numPr>
+        <w:spacing w:before="240" w:beforeAutospacing="0" w:after="0" w:afterAutospacing="0" w:line="264" w:lineRule="auto"/>
+        <w:jc w:val="both"/>
+        <w:rPr>
+          <w:rFonts w:ascii="Verdana" w:hAnsi="Verdana"/>
+          <w:i/>
+          <w:iCs/>
+          <w:sz w:val="22"/>
+          <w:szCs w:val="22"/>
+        </w:rPr>
+      </w:pPr>
+      <w:r>
+        <w:rPr>
+          <w:rFonts w:ascii="Verdana" w:hAnsi="Verdana"/>
+          <w:i/>
+          <w:iCs/>
+          <w:sz w:val="22"/>
+          <w:szCs w:val="22"/>
+        </w:rPr>
+        <w:t>OOP-Lehre:</w:t>
+      </w:r>
+    </w:p>
+    <w:p>
+      <w:pPr>
+        <w:pStyle w:val="p1"/>
+        <w:spacing w:before="240" w:beforeAutospacing="0" w:after="0" w:afterAutospacing="0" w:line="264" w:lineRule="auto"/>
+        <w:ind w:left="708"/>
+        <w:jc w:val="both"/>
+        <w:rPr>
+          <w:rFonts w:ascii="Verdana" w:hAnsi="Verdana"/>
+          <w:sz w:val="22"/>
+          <w:szCs w:val="22"/>
+        </w:rPr>
+      </w:pPr>
+      <w:r>
+        <w:rPr>
+          <w:rFonts w:ascii="Verdana" w:hAnsi="Verdana"/>
+          <w:sz w:val="22"/>
+          <w:szCs w:val="22"/>
+        </w:rPr>
+        <w:t>Welche grundlegenden Konzepte der objektorientierten Programmierung halten Sie für besonders wichtig?</w:t>
+      </w:r>
+    </w:p>
+    <w:p>
+      <w:pPr>
+        <w:pStyle w:val="p1"/>
+        <w:spacing w:before="240" w:beforeAutospacing="0" w:after="0" w:afterAutospacing="0" w:line="264" w:lineRule="auto"/>
+        <w:ind w:left="708"/>
+        <w:jc w:val="both"/>
+        <w:rPr>
+          <w:rFonts w:ascii="Verdana" w:hAnsi="Verdana"/>
+          <w:sz w:val="22"/>
+          <w:szCs w:val="22"/>
+        </w:rPr>
+      </w:pPr>
+      <w:r>
+        <w:rPr>
+          <w:rFonts w:ascii="Verdana" w:hAnsi="Verdana"/>
+          <w:sz w:val="22"/>
+          <w:szCs w:val="22"/>
+        </w:rPr>
+        <w:t>Welche Lernmethoden funktionieren Ihrer Erfahrung nach besonders gut für die Vermittlung von OOP?</w:t>
+      </w:r>
+    </w:p>
+    <w:p>
+      <w:pPr>
+        <w:pStyle w:val="p1"/>
+        <w:spacing w:before="240" w:beforeAutospacing="0" w:after="0" w:afterAutospacing="0" w:line="264" w:lineRule="auto"/>
+        <w:ind w:left="708"/>
+        <w:jc w:val="both"/>
+        <w:rPr>
+          <w:rFonts w:ascii="Verdana" w:hAnsi="Verdana"/>
+          <w:sz w:val="22"/>
+          <w:szCs w:val="22"/>
+        </w:rPr>
+      </w:pPr>
+      <w:r>
+        <w:rPr>
+          <w:rFonts w:ascii="Verdana" w:hAnsi="Verdana"/>
+          <w:sz w:val="22"/>
+          <w:szCs w:val="22"/>
+        </w:rPr>
+        <w:t>Welche Rolle spielen praktische Übungen beim Erlernen von OOP-Konzepten?</w:t>
+      </w:r>
+    </w:p>
+    <w:p>
+      <w:pPr>
+        <w:pStyle w:val="p1"/>
+        <w:spacing w:before="240" w:beforeAutospacing="0" w:after="0" w:afterAutospacing="0" w:line="264" w:lineRule="auto"/>
+        <w:ind w:left="708"/>
+        <w:jc w:val="both"/>
+        <w:rPr>
+          <w:rFonts w:ascii="Verdana" w:hAnsi="Verdana"/>
+          <w:sz w:val="22"/>
+          <w:szCs w:val="22"/>
+        </w:rPr>
+      </w:pPr>
+      <w:r>
+        <w:rPr>
+          <w:rFonts w:ascii="Verdana" w:hAnsi="Verdana"/>
+          <w:sz w:val="22"/>
+          <w:szCs w:val="22"/>
+        </w:rPr>
+        <w:t xml:space="preserve">Bitte bewerten Sie die Bedeutung von </w:t>
+      </w:r>
+      <w:r>
+        <w:rPr>
+          <w:rFonts w:ascii="Verdana" w:hAnsi="Verdana"/>
+          <w:sz w:val="22"/>
+          <w:szCs w:val="22"/>
+        </w:rPr>
+        <w:t>Visualisierung und Interaktivität in der OOP-Lehre</w:t>
+      </w:r>
+      <w:r>
+        <w:rPr>
+          <w:rFonts w:ascii="Verdana" w:hAnsi="Verdana"/>
+          <w:sz w:val="22"/>
+          <w:szCs w:val="22"/>
+        </w:rPr>
+        <w:t xml:space="preserve"> auf einer Skala von 1 bis</w:t>
+      </w:r>
+      <w:r>
+        <w:rPr>
+          <w:rFonts w:ascii="Verdana" w:hAnsi="Verdana"/>
+          <w:sz w:val="22"/>
+          <w:szCs w:val="22"/>
+        </w:rPr>
+        <w:t xml:space="preserve"> </w:t>
+      </w:r>
+      <w:r>
+        <w:rPr>
+          <w:rFonts w:ascii="Verdana" w:hAnsi="Verdana"/>
+          <w:sz w:val="22"/>
+          <w:szCs w:val="22"/>
+        </w:rPr>
+        <w:t>5:</w:t>
+      </w:r>
+      <w:r>
+        <w:rPr>
+          <w:rFonts w:ascii="Verdana" w:hAnsi="Verdana"/>
+          <w:sz w:val="22"/>
+          <w:szCs w:val="22"/>
+        </w:rPr>
+        <w:t xml:space="preserve"> </w:t>
+      </w:r>
+    </w:p>
+    <w:p>
+      <w:pPr>
+        <w:pStyle w:val="p1"/>
+        <w:spacing w:before="240" w:beforeAutospacing="0" w:after="0" w:afterAutospacing="0" w:line="276" w:lineRule="auto"/>
+        <w:ind w:left="708"/>
+        <w:jc w:val="both"/>
+        <w:rPr>
+          <w:rFonts w:ascii="Verdana" w:hAnsi="Verdana"/>
+          <w:sz w:val="22"/>
+          <w:szCs w:val="22"/>
+        </w:rPr>
+      </w:pPr>
+      <w:r>
+        <w:rPr>
+          <w:rFonts w:ascii="Verdana" w:hAnsi="Verdana"/>
+          <w:sz w:val="22"/>
+          <w:szCs w:val="22"/>
+        </w:rPr>
+        <w:fldChar w:fldCharType="begin">
+          <w:ffData>
+            <w:name w:val="Kontrollkästchen1"/>
+            <w:enabled/>
+            <w:calcOnExit w:val="0"/>
+            <w:checkBox>
+              <w:sizeAuto/>
+              <w:default w:val="0"/>
+            </w:checkBox>
+          </w:ffData>
+        </w:fldChar>
+      </w:r>
+      <w:bookmarkStart w:id="0" w:name="Kontrollkästchen1"/>
+      <w:r>
+        <w:rPr>
+          <w:rFonts w:ascii="Verdana" w:hAnsi="Verdana"/>
+          <w:sz w:val="22"/>
+          <w:szCs w:val="22"/>
+        </w:rPr>
+        <w:instrText xml:space="preserve"> FORMCHECKBOX </w:instrText>
+      </w:r>
+      <w:r>
+        <w:rPr>
+          <w:rFonts w:ascii="Verdana" w:hAnsi="Verdana"/>
+          <w:sz w:val="22"/>
+          <w:szCs w:val="22"/>
+        </w:rPr>
+      </w:r>
+      <w:r>
+        <w:rPr>
+          <w:rFonts w:ascii="Verdana" w:hAnsi="Verdana"/>
+          <w:sz w:val="22"/>
+          <w:szCs w:val="22"/>
+        </w:rPr>
+        <w:fldChar w:fldCharType="separate"/>
+      </w:r>
+      <w:r>
+        <w:rPr>
+          <w:rFonts w:ascii="Verdana" w:hAnsi="Verdana"/>
+          <w:sz w:val="22"/>
+          <w:szCs w:val="22"/>
+        </w:rPr>
+        <w:fldChar w:fldCharType="end"/>
+      </w:r>
+      <w:bookmarkEnd w:id="0"/>
+      <w:r>
+        <w:rPr>
+          <w:rFonts w:ascii="Verdana" w:hAnsi="Verdana"/>
+          <w:sz w:val="22"/>
+          <w:szCs w:val="22"/>
+        </w:rPr>
+        <w:t xml:space="preserve"> 1 = unwichtig</w:t>
+      </w:r>
+    </w:p>
+    <w:p>
+      <w:pPr>
+        <w:pStyle w:val="p1"/>
         <w:spacing w:before="0" w:beforeAutospacing="0" w:after="0" w:afterAutospacing="0" w:line="276" w:lineRule="auto"/>
-        <w:jc w:val="both"/>
-        <w:rPr>
-          <w:rFonts w:ascii="Verdana" w:hAnsi="Verdana"/>
-          <w:sz w:val="22"/>
-          <w:szCs w:val="22"/>
-        </w:rPr>
-      </w:pPr>
-      <w:r>
-        <w:rPr>
-          <w:rFonts w:ascii="Verdana" w:hAnsi="Verdana"/>
-          <w:sz w:val="22"/>
-          <w:szCs w:val="22"/>
-        </w:rPr>
-        <w:t>Abschluss &amp; Einverständniserklärung</w:t>
+        <w:ind w:left="708"/>
+        <w:jc w:val="both"/>
+        <w:rPr>
+          <w:rFonts w:ascii="Verdana" w:hAnsi="Verdana"/>
+          <w:sz w:val="22"/>
+          <w:szCs w:val="22"/>
+        </w:rPr>
+      </w:pPr>
+      <w:r>
+        <w:rPr>
+          <w:rFonts w:ascii="Verdana" w:hAnsi="Verdana"/>
+          <w:sz w:val="22"/>
+          <w:szCs w:val="22"/>
+        </w:rPr>
+        <w:fldChar w:fldCharType="begin">
+          <w:ffData>
+            <w:name w:val="Kontrollkästchen2"/>
+            <w:enabled/>
+            <w:calcOnExit w:val="0"/>
+            <w:checkBox>
+              <w:sizeAuto/>
+              <w:default w:val="0"/>
+            </w:checkBox>
+          </w:ffData>
+        </w:fldChar>
+      </w:r>
+      <w:bookmarkStart w:id="1" w:name="Kontrollkästchen2"/>
+      <w:r>
+        <w:rPr>
+          <w:rFonts w:ascii="Verdana" w:hAnsi="Verdana"/>
+          <w:sz w:val="22"/>
+          <w:szCs w:val="22"/>
+        </w:rPr>
+        <w:instrText xml:space="preserve"> FORMCHECKBOX </w:instrText>
+      </w:r>
+      <w:r>
+        <w:rPr>
+          <w:rFonts w:ascii="Verdana" w:hAnsi="Verdana"/>
+          <w:sz w:val="22"/>
+          <w:szCs w:val="22"/>
+        </w:rPr>
+      </w:r>
+      <w:r>
+        <w:rPr>
+          <w:rFonts w:ascii="Verdana" w:hAnsi="Verdana"/>
+          <w:sz w:val="22"/>
+          <w:szCs w:val="22"/>
+        </w:rPr>
+        <w:fldChar w:fldCharType="separate"/>
+      </w:r>
+      <w:r>
+        <w:rPr>
+          <w:rFonts w:ascii="Verdana" w:hAnsi="Verdana"/>
+          <w:sz w:val="22"/>
+          <w:szCs w:val="22"/>
+        </w:rPr>
+        <w:fldChar w:fldCharType="end"/>
+      </w:r>
+      <w:bookmarkEnd w:id="1"/>
+      <w:r>
+        <w:rPr>
+          <w:rFonts w:ascii="Verdana" w:hAnsi="Verdana"/>
+          <w:sz w:val="22"/>
+          <w:szCs w:val="22"/>
+        </w:rPr>
+        <w:t xml:space="preserve"> 2 = eher unwichtig</w:t>
       </w:r>
     </w:p>
     <w:p>
       <w:pPr>
         <w:pStyle w:val="p1"/>
         <w:spacing w:before="0" w:beforeAutospacing="0" w:after="0" w:afterAutospacing="0" w:line="276" w:lineRule="auto"/>
-        <w:jc w:val="both"/>
-        <w:rPr>
-          <w:rFonts w:ascii="Verdana" w:hAnsi="Verdana"/>
-          <w:sz w:val="22"/>
-          <w:szCs w:val="22"/>
-        </w:rPr>
-      </w:pPr>
+        <w:ind w:left="708"/>
+        <w:jc w:val="both"/>
+        <w:rPr>
+          <w:rFonts w:ascii="Verdana" w:hAnsi="Verdana"/>
+          <w:sz w:val="22"/>
+          <w:szCs w:val="22"/>
+        </w:rPr>
+      </w:pPr>
+      <w:r>
+        <w:rPr>
+          <w:rFonts w:ascii="Verdana" w:hAnsi="Verdana"/>
+          <w:sz w:val="22"/>
+          <w:szCs w:val="22"/>
+        </w:rPr>
+        <w:fldChar w:fldCharType="begin">
+          <w:ffData>
+            <w:name w:val="Kontrollkästchen3"/>
+            <w:enabled/>
+            <w:calcOnExit w:val="0"/>
+            <w:checkBox>
+              <w:sizeAuto/>
+              <w:default w:val="0"/>
+            </w:checkBox>
+          </w:ffData>
+        </w:fldChar>
+      </w:r>
+      <w:bookmarkStart w:id="2" w:name="Kontrollkästchen3"/>
+      <w:r>
+        <w:rPr>
+          <w:rFonts w:ascii="Verdana" w:hAnsi="Verdana"/>
+          <w:sz w:val="22"/>
+          <w:szCs w:val="22"/>
+        </w:rPr>
+        <w:instrText xml:space="preserve"> FORMCHECKBOX </w:instrText>
+      </w:r>
+      <w:r>
+        <w:rPr>
+          <w:rFonts w:ascii="Verdana" w:hAnsi="Verdana"/>
+          <w:sz w:val="22"/>
+          <w:szCs w:val="22"/>
+        </w:rPr>
+      </w:r>
+      <w:r>
+        <w:rPr>
+          <w:rFonts w:ascii="Verdana" w:hAnsi="Verdana"/>
+          <w:sz w:val="22"/>
+          <w:szCs w:val="22"/>
+        </w:rPr>
+        <w:fldChar w:fldCharType="separate"/>
+      </w:r>
+      <w:r>
+        <w:rPr>
+          <w:rFonts w:ascii="Verdana" w:hAnsi="Verdana"/>
+          <w:sz w:val="22"/>
+          <w:szCs w:val="22"/>
+        </w:rPr>
+        <w:fldChar w:fldCharType="end"/>
+      </w:r>
+      <w:bookmarkEnd w:id="2"/>
+      <w:r>
+        <w:rPr>
+          <w:rFonts w:ascii="Verdana" w:hAnsi="Verdana"/>
+          <w:sz w:val="22"/>
+          <w:szCs w:val="22"/>
+        </w:rPr>
+        <w:t xml:space="preserve"> 3 = neutral</w:t>
+      </w:r>
     </w:p>
     <w:p>
       <w:pPr>
         <w:pStyle w:val="p1"/>
         <w:spacing w:before="0" w:beforeAutospacing="0" w:after="0" w:afterAutospacing="0" w:line="276" w:lineRule="auto"/>
-        <w:jc w:val="both"/>
-        <w:rPr>
-          <w:rFonts w:ascii="Verdana" w:hAnsi="Verdana"/>
-          <w:sz w:val="22"/>
-          <w:szCs w:val="22"/>
-          <w:u w:val="single"/>
-        </w:rPr>
-      </w:pPr>
-      <w:r>
-        <w:rPr>
-          <w:rFonts w:ascii="Verdana" w:hAnsi="Verdana"/>
-          <w:sz w:val="22"/>
-          <w:szCs w:val="22"/>
-          <w:u w:val="single"/>
-        </w:rPr>
-        <w:t>Fragen:</w:t>
+        <w:ind w:left="708"/>
+        <w:jc w:val="both"/>
+        <w:rPr>
+          <w:rFonts w:ascii="Verdana" w:hAnsi="Verdana"/>
+          <w:sz w:val="22"/>
+          <w:szCs w:val="22"/>
+        </w:rPr>
+      </w:pPr>
+      <w:r>
+        <w:rPr>
+          <w:rFonts w:ascii="Verdana" w:hAnsi="Verdana"/>
+          <w:sz w:val="22"/>
+          <w:szCs w:val="22"/>
+        </w:rPr>
+        <w:fldChar w:fldCharType="begin">
+          <w:ffData>
+            <w:name w:val="Kontrollkästchen4"/>
+            <w:enabled/>
+            <w:calcOnExit w:val="0"/>
+            <w:checkBox>
+              <w:sizeAuto/>
+              <w:default w:val="0"/>
+            </w:checkBox>
+          </w:ffData>
+        </w:fldChar>
+      </w:r>
+      <w:bookmarkStart w:id="3" w:name="Kontrollkästchen4"/>
+      <w:r>
+        <w:rPr>
+          <w:rFonts w:ascii="Verdana" w:hAnsi="Verdana"/>
+          <w:sz w:val="22"/>
+          <w:szCs w:val="22"/>
+        </w:rPr>
+        <w:instrText xml:space="preserve"> FORMCHECKBOX </w:instrText>
+      </w:r>
+      <w:r>
+        <w:rPr>
+          <w:rFonts w:ascii="Verdana" w:hAnsi="Verdana"/>
+          <w:sz w:val="22"/>
+          <w:szCs w:val="22"/>
+        </w:rPr>
+      </w:r>
+      <w:r>
+        <w:rPr>
+          <w:rFonts w:ascii="Verdana" w:hAnsi="Verdana"/>
+          <w:sz w:val="22"/>
+          <w:szCs w:val="22"/>
+        </w:rPr>
+        <w:fldChar w:fldCharType="separate"/>
+      </w:r>
+      <w:r>
+        <w:rPr>
+          <w:rFonts w:ascii="Verdana" w:hAnsi="Verdana"/>
+          <w:sz w:val="22"/>
+          <w:szCs w:val="22"/>
+        </w:rPr>
+        <w:fldChar w:fldCharType="end"/>
+      </w:r>
+      <w:bookmarkEnd w:id="3"/>
+      <w:r>
+        <w:rPr>
+          <w:rFonts w:ascii="Verdana" w:hAnsi="Verdana"/>
+          <w:sz w:val="22"/>
+          <w:szCs w:val="22"/>
+        </w:rPr>
+        <w:t xml:space="preserve"> 4 = eher wichtig</w:t>
       </w:r>
     </w:p>
     <w:p>
       <w:pPr>
         <w:pStyle w:val="p1"/>
         <w:spacing w:before="0" w:beforeAutospacing="0" w:after="0" w:afterAutospacing="0" w:line="276" w:lineRule="auto"/>
-        <w:jc w:val="both"/>
-        <w:rPr>
-          <w:rFonts w:ascii="Verdana" w:hAnsi="Verdana"/>
-          <w:sz w:val="22"/>
-          <w:szCs w:val="22"/>
-          <w:u w:val="single"/>
+        <w:ind w:left="708"/>
+        <w:jc w:val="both"/>
+        <w:rPr>
+          <w:rFonts w:ascii="Verdana" w:hAnsi="Verdana"/>
+          <w:sz w:val="22"/>
+          <w:szCs w:val="22"/>
+        </w:rPr>
+      </w:pPr>
+      <w:r>
+        <w:rPr>
+          <w:rFonts w:ascii="Verdana" w:hAnsi="Verdana"/>
+          <w:sz w:val="22"/>
+          <w:szCs w:val="22"/>
+        </w:rPr>
+        <w:fldChar w:fldCharType="begin">
+          <w:ffData>
+            <w:name w:val="Kontrollkästchen5"/>
+            <w:enabled/>
+            <w:calcOnExit w:val="0"/>
+            <w:checkBox>
+              <w:sizeAuto/>
+              <w:default w:val="0"/>
+            </w:checkBox>
+          </w:ffData>
+        </w:fldChar>
+      </w:r>
+      <w:bookmarkStart w:id="4" w:name="Kontrollkästchen5"/>
+      <w:r>
+        <w:rPr>
+          <w:rFonts w:ascii="Verdana" w:hAnsi="Verdana"/>
+          <w:sz w:val="22"/>
+          <w:szCs w:val="22"/>
+        </w:rPr>
+        <w:instrText xml:space="preserve"> FORMCHECKBOX </w:instrText>
+      </w:r>
+      <w:r>
+        <w:rPr>
+          <w:rFonts w:ascii="Verdana" w:hAnsi="Verdana"/>
+          <w:sz w:val="22"/>
+          <w:szCs w:val="22"/>
+        </w:rPr>
+      </w:r>
+      <w:r>
+        <w:rPr>
+          <w:rFonts w:ascii="Verdana" w:hAnsi="Verdana"/>
+          <w:sz w:val="22"/>
+          <w:szCs w:val="22"/>
+        </w:rPr>
+        <w:fldChar w:fldCharType="separate"/>
+      </w:r>
+      <w:r>
+        <w:rPr>
+          <w:rFonts w:ascii="Verdana" w:hAnsi="Verdana"/>
+          <w:sz w:val="22"/>
+          <w:szCs w:val="22"/>
+        </w:rPr>
+        <w:fldChar w:fldCharType="end"/>
+      </w:r>
+      <w:bookmarkEnd w:id="4"/>
+      <w:r>
+        <w:rPr>
+          <w:rFonts w:ascii="Verdana" w:hAnsi="Verdana"/>
+          <w:sz w:val="22"/>
+          <w:szCs w:val="22"/>
+        </w:rPr>
+        <w:t xml:space="preserve"> 5 = sehr wichtig</w:t>
+      </w:r>
+    </w:p>
+    <w:p>
+      <w:pPr>
+        <w:spacing w:before="240"/>
+        <w:rPr>
+          <w:rFonts w:ascii="Verdana" w:hAnsi="Verdana"/>
+          <w:sz w:val="22"/>
+          <w:szCs w:val="22"/>
+        </w:rPr>
+      </w:pPr>
+      <w:r>
+        <w:rPr>
+          <w:rFonts w:ascii="Verdana" w:hAnsi="Verdana"/>
+          <w:sz w:val="22"/>
+          <w:szCs w:val="22"/>
+        </w:rPr>
+        <w:tab/>
+        <w:t xml:space="preserve">Bitte begründen Sie Ihre Einschätzung </w:t>
+      </w:r>
+      <w:r>
+        <w:rPr>
+          <w:rFonts w:ascii="Verdana" w:hAnsi="Verdana"/>
+          <w:sz w:val="22"/>
+          <w:szCs w:val="22"/>
+        </w:rPr>
+        <w:t>kurz</w:t>
+      </w:r>
+      <w:r>
+        <w:rPr>
+          <w:rFonts w:ascii="Verdana" w:hAnsi="Verdana"/>
+          <w:sz w:val="22"/>
+          <w:szCs w:val="22"/>
+        </w:rPr>
+        <w:t>.</w:t>
+      </w:r>
+    </w:p>
+    <w:p>
+      <w:pPr>
+        <w:spacing w:before="240"/>
+        <w:rPr>
+          <w:rFonts w:ascii="Verdana" w:hAnsi="Verdana"/>
+          <w:sz w:val="22"/>
+          <w:szCs w:val="22"/>
+        </w:rPr>
+      </w:pPr>
+    </w:p>
+    <w:p>
+      <w:pPr>
+        <w:pStyle w:val="Listenabsatz"/>
+        <w:numPr>
+          <w:ilvl w:val="0"/>
+          <w:numId w:val="2"/>
+        </w:numPr>
+        <w:spacing w:after="240"/>
+        <w:rPr>
+          <w:rFonts w:ascii="Verdana" w:hAnsi="Verdana"/>
+          <w:sz w:val="22"/>
+          <w:szCs w:val="22"/>
+        </w:rPr>
+      </w:pPr>
+      <w:r>
+        <w:rPr>
+          <w:rFonts w:ascii="Verdana" w:hAnsi="Verdana"/>
+          <w:i/>
+          <w:iCs/>
+          <w:sz w:val="22"/>
+          <w:szCs w:val="22"/>
+        </w:rPr>
+        <w:lastRenderedPageBreak/>
+        <w:t>Lernschwierigkeiten der Studierenden</w:t>
+      </w:r>
+      <w:r>
+        <w:rPr>
+          <w:rFonts w:ascii="Verdana" w:hAnsi="Verdana"/>
+          <w:sz w:val="22"/>
+          <w:szCs w:val="22"/>
+        </w:rPr>
+        <w:t>:</w:t>
+      </w:r>
+    </w:p>
+    <w:p>
+      <w:pPr>
+        <w:pStyle w:val="Listenabsatz"/>
+        <w:spacing w:after="240"/>
+        <w:rPr>
+          <w:rFonts w:ascii="Verdana" w:hAnsi="Verdana"/>
+          <w:sz w:val="22"/>
+          <w:szCs w:val="22"/>
+        </w:rPr>
+      </w:pPr>
+    </w:p>
+    <w:p>
+      <w:pPr>
+        <w:pStyle w:val="Listenabsatz"/>
+        <w:spacing w:before="240"/>
+        <w:rPr>
+          <w:rFonts w:ascii="Verdana" w:hAnsi="Verdana"/>
+          <w:sz w:val="22"/>
+          <w:szCs w:val="22"/>
+        </w:rPr>
+      </w:pPr>
+      <w:r>
+        <w:rPr>
+          <w:rFonts w:ascii="Verdana" w:hAnsi="Verdana"/>
+          <w:sz w:val="22"/>
+          <w:szCs w:val="22"/>
+        </w:rPr>
+        <w:t>Bei welchen OOP-Konzepten treten bei Studierenden besonders häufig Verständnisprobleme auf?</w:t>
+      </w:r>
+    </w:p>
+    <w:p>
+      <w:pPr>
+        <w:rPr>
+          <w:rFonts w:ascii="Verdana" w:hAnsi="Verdana"/>
+          <w:sz w:val="22"/>
+          <w:szCs w:val="22"/>
+        </w:rPr>
+      </w:pPr>
+    </w:p>
+    <w:p>
+      <w:pPr>
+        <w:pStyle w:val="Listenabsatz"/>
+        <w:rPr>
+          <w:rFonts w:ascii="Verdana" w:hAnsi="Verdana"/>
+          <w:sz w:val="22"/>
+          <w:szCs w:val="22"/>
+        </w:rPr>
+      </w:pPr>
+      <w:r>
+        <w:rPr>
+          <w:rFonts w:ascii="Verdana" w:hAnsi="Verdana"/>
+          <w:sz w:val="22"/>
+          <w:szCs w:val="22"/>
+        </w:rPr>
+        <w:t>Welche typischen Missverständnisse treten bei den Studierenden auf?</w:t>
+      </w:r>
+    </w:p>
+    <w:p>
+      <w:pPr>
+        <w:pStyle w:val="Listenabsatz"/>
+        <w:rPr>
+          <w:rFonts w:ascii="Verdana" w:hAnsi="Verdana"/>
+          <w:sz w:val="22"/>
+          <w:szCs w:val="22"/>
         </w:rPr>
       </w:pPr>
     </w:p>
@@ -333,17 +1025,26 @@
       <w:r>
         <w:rPr>
           <w:rFonts w:ascii="Verdana" w:hAnsi="Verdana"/>
-          <w:sz w:val="22"/>
-          <w:szCs w:val="22"/>
-        </w:rPr>
-        <w:t xml:space="preserve">Einstieg: </w:t>
+          <w:i/>
+          <w:iCs/>
+          <w:sz w:val="22"/>
+          <w:szCs w:val="22"/>
+        </w:rPr>
+        <w:t>Anforderungen an das Spiel „Deep Space Debugger“ für den Lernerfolg</w:t>
+      </w:r>
+      <w:r>
+        <w:rPr>
+          <w:rFonts w:ascii="Verdana" w:hAnsi="Verdana"/>
+          <w:sz w:val="22"/>
+          <w:szCs w:val="22"/>
+        </w:rPr>
+        <w:t>:</w:t>
       </w:r>
     </w:p>
     <w:p>
       <w:pPr>
         <w:pStyle w:val="p1"/>
         <w:spacing w:before="0" w:beforeAutospacing="0" w:after="0" w:afterAutospacing="0" w:line="276" w:lineRule="auto"/>
-        <w:ind w:left="720"/>
         <w:jc w:val="both"/>
         <w:rPr>
           <w:rFonts w:ascii="Verdana" w:hAnsi="Verdana"/>
@@ -370,7 +1071,7 @@
           <w:sz w:val="22"/>
           <w:szCs w:val="22"/>
         </w:rPr>
-        <w:t>Können Sie kurz beschreiben, welche Rolle Sie derzeit in der Lehre der objektorientierten Programmierung an der HTWK Leipzig einnehmen?</w:t>
+        <w:t xml:space="preserve">Kontext: </w:t>
       </w:r>
     </w:p>
     <w:p>
@@ -404,16 +1105,37 @@
           <w:sz w:val="22"/>
           <w:szCs w:val="22"/>
         </w:rPr>
-        <w:t>Welche Erfahrungen haben Sie in der Vermittlung objektorientierten Programmierkonzepte gesammelt</w:t>
-      </w:r>
-      <w:r>
-        <w:rPr>
-          <w:rFonts w:ascii="Verdana" w:hAnsi="Verdana"/>
-          <w:sz w:val="22"/>
-          <w:szCs w:val="22"/>
-        </w:rPr>
-        <w:t>?</w:t>
-      </w:r>
+        <w:t xml:space="preserve">Im </w:t>
+      </w:r>
+      <w:r>
+        <w:rPr>
+          <w:rFonts w:ascii="Verdana" w:hAnsi="Verdana"/>
+          <w:sz w:val="22"/>
+          <w:szCs w:val="22"/>
+        </w:rPr>
+        <w:t>Folgenden</w:t>
+      </w:r>
+      <w:r>
+        <w:rPr>
+          <w:rFonts w:ascii="Verdana" w:hAnsi="Verdana"/>
+          <w:sz w:val="22"/>
+          <w:szCs w:val="22"/>
+        </w:rPr>
+        <w:t xml:space="preserve"> beziehen sich die Fragen auf ein 2D-Serious Game, das Studierende ergänzend zur OOP-Lehre nutzen sollen. Ziel ist die spielerische Vermittlung grundlegender OOP-Konzepte durch interaktive Aufgaben, Rätsel und Gameplay-Mechaniken.</w:t>
+      </w:r>
+    </w:p>
+    <w:p>
+      <w:pPr>
+        <w:pStyle w:val="p1"/>
+        <w:spacing w:before="0" w:beforeAutospacing="0" w:after="0" w:afterAutospacing="0" w:line="276" w:lineRule="auto"/>
+        <w:ind w:left="360"/>
+        <w:jc w:val="both"/>
+        <w:rPr>
+          <w:rFonts w:ascii="Verdana" w:hAnsi="Verdana"/>
+          <w:sz w:val="22"/>
+          <w:szCs w:val="22"/>
+        </w:rPr>
+      </w:pPr>
     </w:p>
     <w:p>
       <w:pPr>
@@ -427,42 +1149,14 @@
           <w:szCs w:val="22"/>
         </w:rPr>
       </w:pPr>
-    </w:p>
-    <w:p>
-      <w:pPr>
-        <w:pStyle w:val="p1"/>
-        <w:numPr>
-          <w:ilvl w:val="0"/>
-          <w:numId w:val="2"/>
-        </w:numPr>
-        <w:spacing w:before="0" w:beforeAutospacing="0" w:after="0" w:afterAutospacing="0" w:line="276" w:lineRule="auto"/>
-        <w:jc w:val="both"/>
-        <w:rPr>
-          <w:rFonts w:ascii="Verdana" w:hAnsi="Verdana"/>
-          <w:sz w:val="22"/>
-          <w:szCs w:val="22"/>
-        </w:rPr>
-      </w:pPr>
-      <w:r>
-        <w:rPr>
-          <w:rFonts w:ascii="Verdana" w:hAnsi="Verdana"/>
-          <w:sz w:val="22"/>
-          <w:szCs w:val="22"/>
-        </w:rPr>
-        <w:t>OOP-Lehre:</w:t>
-      </w:r>
-    </w:p>
-    <w:p>
-      <w:pPr>
-        <w:pStyle w:val="p1"/>
-        <w:spacing w:before="0" w:beforeAutospacing="0" w:after="0" w:afterAutospacing="0" w:line="276" w:lineRule="auto"/>
-        <w:jc w:val="both"/>
-        <w:rPr>
-          <w:rFonts w:ascii="Verdana" w:hAnsi="Verdana"/>
-          <w:sz w:val="22"/>
-          <w:szCs w:val="22"/>
-        </w:rPr>
-      </w:pPr>
+      <w:r>
+        <w:rPr>
+          <w:rFonts w:ascii="Verdana" w:hAnsi="Verdana"/>
+          <w:sz w:val="22"/>
+          <w:szCs w:val="22"/>
+        </w:rPr>
+        <w:t>Sehen Sie Potenzial in Serious Games zur Vermittlung objektorientierter Programmierung?</w:t>
+      </w:r>
     </w:p>
     <w:p>
       <w:pPr>
@@ -476,14 +1170,6 @@
           <w:szCs w:val="22"/>
         </w:rPr>
       </w:pPr>
-      <w:r>
-        <w:rPr>
-          <w:rFonts w:ascii="Verdana" w:hAnsi="Verdana"/>
-          <w:sz w:val="22"/>
-          <w:szCs w:val="22"/>
-        </w:rPr>
-        <w:t>Welche grundlegenden Konzepte der objektorientierten Programmierung halten Sie für besonders wichtig?</w:t>
-      </w:r>
     </w:p>
     <w:p>
       <w:pPr>
@@ -497,6 +1183,22 @@
           <w:szCs w:val="22"/>
         </w:rPr>
       </w:pPr>
+      <w:r>
+        <w:rPr>
+          <w:rFonts w:ascii="Verdana" w:hAnsi="Verdana"/>
+          <w:sz w:val="22"/>
+          <w:szCs w:val="22"/>
+        </w:rPr>
+        <w:t>Welche Grenzen oder Herausforderungen sehen Sie beim Einsatz von Serious Games in der OOP-Lehre</w:t>
+      </w:r>
+      <w:r>
+        <w:rPr>
+          <w:rFonts w:ascii="Verdana" w:hAnsi="Verdana"/>
+          <w:sz w:val="22"/>
+          <w:szCs w:val="22"/>
+        </w:rPr>
+        <w:t>?</w:t>
+      </w:r>
     </w:p>
     <w:p>
       <w:pPr>
@@ -510,14 +1212,6 @@
           <w:szCs w:val="22"/>
         </w:rPr>
       </w:pPr>
-      <w:r>
-        <w:rPr>
-          <w:rFonts w:ascii="Verdana" w:hAnsi="Verdana"/>
-          <w:sz w:val="22"/>
-          <w:szCs w:val="22"/>
-        </w:rPr>
-        <w:t>Welche Lernmethoden funktionieren Ihrer Erfahrung nach besonders gut für die Vermittlung von OOP?</w:t>
-      </w:r>
     </w:p>
     <w:p>
       <w:pPr>
@@ -531,6 +1225,14 @@
           <w:szCs w:val="22"/>
         </w:rPr>
       </w:pPr>
+      <w:r>
+        <w:rPr>
+          <w:rFonts w:ascii="Verdana" w:hAnsi="Verdana"/>
+          <w:sz w:val="22"/>
+          <w:szCs w:val="22"/>
+        </w:rPr>
+        <w:t>Welche OOP-Konzepte sollten in einem Serious Game unbedingt behandelt werden?</w:t>
+      </w:r>
     </w:p>
     <w:p>
       <w:pPr>
@@ -544,14 +1246,6 @@
           <w:szCs w:val="22"/>
         </w:rPr>
       </w:pPr>
-      <w:r>
-        <w:rPr>
-          <w:rFonts w:ascii="Verdana" w:hAnsi="Verdana"/>
-          <w:sz w:val="22"/>
-          <w:szCs w:val="22"/>
-        </w:rPr>
-        <w:t>Welche Rolle spielen praktische Übungen beim Erlernen von OOP-Konzepten?</w:t>
-      </w:r>
     </w:p>
     <w:p>
       <w:pPr>
@@ -565,6 +1259,14 @@
           <w:szCs w:val="22"/>
         </w:rPr>
       </w:pPr>
+      <w:r>
+        <w:rPr>
+          <w:rFonts w:ascii="Verdana" w:hAnsi="Verdana"/>
+          <w:sz w:val="22"/>
+          <w:szCs w:val="22"/>
+        </w:rPr>
+        <w:t>Welche OOP-Konzepte sind Ihrer Meinung nach zu komplex für ein Serious Game?</w:t>
+      </w:r>
     </w:p>
     <w:p>
       <w:pPr>
@@ -578,197 +1280,6 @@
           <w:szCs w:val="22"/>
         </w:rPr>
       </w:pPr>
-      <w:r>
-        <w:rPr>
-          <w:rFonts w:ascii="Verdana" w:hAnsi="Verdana"/>
-          <w:sz w:val="22"/>
-          <w:szCs w:val="22"/>
-        </w:rPr>
-        <w:t>Wie wichtig sind Visualisierung und Interaktivität in der OOP-Lehre?</w:t>
-      </w:r>
-      <w:r>
-        <w:rPr>
-          <w:rFonts w:ascii="Verdana" w:hAnsi="Verdana"/>
-          <w:sz w:val="22"/>
-          <w:szCs w:val="22"/>
-        </w:rPr>
-        <w:t xml:space="preserve"> (hinsichtlich Gamification</w:t>
-      </w:r>
-      <w:r>
-        <w:rPr>
-          <w:rFonts w:ascii="Verdana" w:hAnsi="Verdana"/>
-          <w:sz w:val="22"/>
-          <w:szCs w:val="22"/>
-        </w:rPr>
-        <w:t>)</w:t>
-      </w:r>
-    </w:p>
-    <w:p>
-      <w:pPr>
-        <w:rPr>
-          <w:rFonts w:ascii="Verdana" w:hAnsi="Verdana"/>
-          <w:sz w:val="22"/>
-          <w:szCs w:val="22"/>
-        </w:rPr>
-      </w:pPr>
-    </w:p>
-    <w:p>
-      <w:pPr>
-        <w:pStyle w:val="Listenabsatz"/>
-        <w:numPr>
-          <w:ilvl w:val="0"/>
-          <w:numId w:val="2"/>
-        </w:numPr>
-        <w:rPr>
-          <w:rFonts w:ascii="Verdana" w:hAnsi="Verdana"/>
-          <w:sz w:val="22"/>
-          <w:szCs w:val="22"/>
-        </w:rPr>
-      </w:pPr>
-      <w:r>
-        <w:rPr>
-          <w:rFonts w:ascii="Verdana" w:hAnsi="Verdana"/>
-          <w:sz w:val="22"/>
-          <w:szCs w:val="22"/>
-        </w:rPr>
-        <w:t>Lernschwierigkeiten der Studierenden:</w:t>
-      </w:r>
-    </w:p>
-    <w:p>
-      <w:pPr>
-        <w:pStyle w:val="Listenabsatz"/>
-        <w:rPr>
-          <w:rFonts w:ascii="Verdana" w:hAnsi="Verdana"/>
-          <w:sz w:val="22"/>
-          <w:szCs w:val="22"/>
-        </w:rPr>
-      </w:pPr>
-    </w:p>
-    <w:p>
-      <w:pPr>
-        <w:pStyle w:val="Listenabsatz"/>
-        <w:rPr>
-          <w:rFonts w:ascii="Verdana" w:hAnsi="Verdana"/>
-          <w:sz w:val="22"/>
-          <w:szCs w:val="22"/>
-        </w:rPr>
-      </w:pPr>
-      <w:r>
-        <w:rPr>
-          <w:rFonts w:ascii="Verdana" w:hAnsi="Verdana"/>
-          <w:sz w:val="22"/>
-          <w:szCs w:val="22"/>
-        </w:rPr>
-        <w:t>Bei welchen OOP-Konzepten treten bei Studierenden besonders häufig Verständnisprobleme auf?</w:t>
-      </w:r>
-      <w:r>
-        <w:rPr>
-          <w:rFonts w:ascii="Verdana" w:hAnsi="Verdana"/>
-          <w:sz w:val="22"/>
-          <w:szCs w:val="22"/>
-        </w:rPr>
-        <w:t xml:space="preserve"> (</w:t>
-      </w:r>
-      <w:r>
-        <w:rPr>
-          <w:rFonts w:ascii="Verdana" w:hAnsi="Verdana"/>
-          <w:sz w:val="22"/>
-          <w:szCs w:val="22"/>
-        </w:rPr>
-        <w:t xml:space="preserve">notwendig für </w:t>
-      </w:r>
-      <w:r>
-        <w:rPr>
-          <w:rFonts w:ascii="Verdana" w:hAnsi="Verdana"/>
-          <w:sz w:val="22"/>
-          <w:szCs w:val="22"/>
-        </w:rPr>
-        <w:t>Fokussierung im Spiel)</w:t>
-      </w:r>
-    </w:p>
-    <w:p>
-      <w:pPr>
-        <w:pStyle w:val="Listenabsatz"/>
-        <w:rPr>
-          <w:rFonts w:ascii="Verdana" w:hAnsi="Verdana"/>
-          <w:sz w:val="22"/>
-          <w:szCs w:val="22"/>
-        </w:rPr>
-      </w:pPr>
-    </w:p>
-    <w:p>
-      <w:pPr>
-        <w:pStyle w:val="Listenabsatz"/>
-        <w:rPr>
-          <w:rFonts w:ascii="Verdana" w:hAnsi="Verdana"/>
-          <w:sz w:val="22"/>
-          <w:szCs w:val="22"/>
-        </w:rPr>
-      </w:pPr>
-      <w:r>
-        <w:rPr>
-          <w:rFonts w:ascii="Verdana" w:hAnsi="Verdana"/>
-          <w:sz w:val="22"/>
-          <w:szCs w:val="22"/>
-        </w:rPr>
-        <w:t>Welche typischen Missverständnisse treten bei den Studierenden auf?</w:t>
-      </w:r>
-    </w:p>
-    <w:p>
-      <w:pPr>
-        <w:pStyle w:val="Listenabsatz"/>
-        <w:rPr>
-          <w:rFonts w:ascii="Verdana" w:hAnsi="Verdana"/>
-          <w:sz w:val="22"/>
-          <w:szCs w:val="22"/>
-        </w:rPr>
-      </w:pPr>
-    </w:p>
-    <w:p>
-      <w:pPr>
-        <w:pStyle w:val="p1"/>
-        <w:numPr>
-          <w:ilvl w:val="0"/>
-          <w:numId w:val="2"/>
-        </w:numPr>
-        <w:spacing w:before="0" w:beforeAutospacing="0" w:after="0" w:afterAutospacing="0" w:line="276" w:lineRule="auto"/>
-        <w:jc w:val="both"/>
-        <w:rPr>
-          <w:rFonts w:ascii="Verdana" w:hAnsi="Verdana"/>
-          <w:sz w:val="22"/>
-          <w:szCs w:val="22"/>
-        </w:rPr>
-      </w:pPr>
-      <w:r>
-        <w:rPr>
-          <w:rFonts w:ascii="Verdana" w:hAnsi="Verdana"/>
-          <w:sz w:val="22"/>
-          <w:szCs w:val="22"/>
-        </w:rPr>
-        <w:lastRenderedPageBreak/>
-        <w:t>Anforderungen an das Spiel „Deep Space Debugger“ für den Lernerfolg</w:t>
-      </w:r>
-      <w:r>
-        <w:rPr>
-          <w:rFonts w:ascii="Verdana" w:hAnsi="Verdana"/>
-          <w:sz w:val="22"/>
-          <w:szCs w:val="22"/>
-        </w:rPr>
-        <w:t>:</w:t>
-      </w:r>
-    </w:p>
-    <w:p>
-      <w:pPr>
-        <w:pStyle w:val="p1"/>
-        <w:spacing w:before="0" w:beforeAutospacing="0" w:after="0" w:afterAutospacing="0" w:line="276" w:lineRule="auto"/>
-        <w:ind w:left="360"/>
-        <w:jc w:val="both"/>
-        <w:rPr>
-          <w:rFonts w:ascii="Verdana" w:hAnsi="Verdana"/>
-          <w:sz w:val="22"/>
-          <w:szCs w:val="22"/>
-        </w:rPr>
-      </w:pPr>
     </w:p>
     <w:p>
       <w:pPr>
@@ -788,157 +1299,40 @@
           <w:sz w:val="22"/>
           <w:szCs w:val="22"/>
         </w:rPr>
-        <w:t>Sehen Sie Potenzial in Serious Games zur Vermittlung objektorientierter Programmierung</w:t>
-      </w:r>
-      <w:r>
-        <w:rPr>
-          <w:rFonts w:ascii="Verdana" w:hAnsi="Verdana"/>
-          <w:sz w:val="22"/>
-          <w:szCs w:val="22"/>
-        </w:rPr>
-        <w:t xml:space="preserve"> und gibt es Vortei</w:t>
-      </w:r>
-      <w:r>
-        <w:rPr>
-          <w:rFonts w:ascii="Verdana" w:hAnsi="Verdana"/>
-          <w:sz w:val="22"/>
-          <w:szCs w:val="22"/>
-        </w:rPr>
-        <w:t>le</w:t>
-      </w:r>
-      <w:r>
-        <w:rPr>
-          <w:rFonts w:ascii="Verdana" w:hAnsi="Verdana"/>
-          <w:sz w:val="22"/>
-          <w:szCs w:val="22"/>
-        </w:rPr>
-        <w:t>?</w:t>
-      </w:r>
-    </w:p>
-    <w:p>
-      <w:pPr>
-        <w:pStyle w:val="p1"/>
-        <w:spacing w:before="0" w:beforeAutospacing="0" w:after="0" w:afterAutospacing="0" w:line="276" w:lineRule="auto"/>
-        <w:ind w:left="708"/>
-        <w:jc w:val="both"/>
-        <w:rPr>
-          <w:rFonts w:ascii="Verdana" w:hAnsi="Verdana"/>
-          <w:sz w:val="22"/>
-          <w:szCs w:val="22"/>
-        </w:rPr>
-      </w:pPr>
-    </w:p>
-    <w:p>
-      <w:pPr>
-        <w:pStyle w:val="p1"/>
-        <w:spacing w:before="0" w:beforeAutospacing="0" w:after="0" w:afterAutospacing="0" w:line="276" w:lineRule="auto"/>
-        <w:ind w:left="708"/>
-        <w:jc w:val="both"/>
-        <w:rPr>
-          <w:rFonts w:ascii="Verdana" w:hAnsi="Verdana"/>
-          <w:sz w:val="22"/>
-          <w:szCs w:val="22"/>
-        </w:rPr>
-      </w:pPr>
-      <w:r>
-        <w:rPr>
-          <w:rFonts w:ascii="Verdana" w:hAnsi="Verdana"/>
-          <w:sz w:val="22"/>
-          <w:szCs w:val="22"/>
-        </w:rPr>
-        <w:t>Welche OOP-Konzepte sollten in einem Serious Game unbedingt behandelt werden?</w:t>
-      </w:r>
-    </w:p>
-    <w:p>
-      <w:pPr>
-        <w:pStyle w:val="p1"/>
-        <w:spacing w:before="0" w:beforeAutospacing="0" w:after="0" w:afterAutospacing="0" w:line="276" w:lineRule="auto"/>
-        <w:ind w:left="708"/>
-        <w:jc w:val="both"/>
-        <w:rPr>
-          <w:rFonts w:ascii="Verdana" w:hAnsi="Verdana"/>
-          <w:sz w:val="22"/>
-          <w:szCs w:val="22"/>
-        </w:rPr>
-      </w:pPr>
-    </w:p>
-    <w:p>
-      <w:pPr>
-        <w:pStyle w:val="p1"/>
-        <w:spacing w:before="0" w:beforeAutospacing="0" w:after="0" w:afterAutospacing="0" w:line="276" w:lineRule="auto"/>
-        <w:ind w:left="708"/>
-        <w:jc w:val="both"/>
-        <w:rPr>
-          <w:rFonts w:ascii="Verdana" w:hAnsi="Verdana"/>
-          <w:sz w:val="22"/>
-          <w:szCs w:val="22"/>
-        </w:rPr>
-      </w:pPr>
-      <w:r>
-        <w:rPr>
-          <w:rFonts w:ascii="Verdana" w:hAnsi="Verdana"/>
-          <w:sz w:val="22"/>
-          <w:szCs w:val="22"/>
-        </w:rPr>
-        <w:t>Welche OOP-Konzepte sind Ihrer Meinung nach zu komplex für ein Serious Game?</w:t>
-      </w:r>
-    </w:p>
-    <w:p>
-      <w:pPr>
-        <w:pStyle w:val="p1"/>
-        <w:spacing w:before="0" w:beforeAutospacing="0" w:after="0" w:afterAutospacing="0" w:line="276" w:lineRule="auto"/>
-        <w:ind w:left="708"/>
-        <w:jc w:val="both"/>
-        <w:rPr>
-          <w:rFonts w:ascii="Verdana" w:hAnsi="Verdana"/>
-          <w:sz w:val="22"/>
-          <w:szCs w:val="22"/>
-        </w:rPr>
-      </w:pPr>
-    </w:p>
-    <w:p>
-      <w:pPr>
-        <w:pStyle w:val="p1"/>
-        <w:spacing w:before="0" w:beforeAutospacing="0" w:after="0" w:afterAutospacing="0" w:line="276" w:lineRule="auto"/>
-        <w:ind w:left="708"/>
-        <w:jc w:val="both"/>
-        <w:rPr>
-          <w:rFonts w:ascii="Verdana" w:hAnsi="Verdana"/>
-          <w:sz w:val="22"/>
-          <w:szCs w:val="22"/>
-        </w:rPr>
-      </w:pPr>
-      <w:r>
-        <w:rPr>
-          <w:rFonts w:ascii="Verdana" w:hAnsi="Verdana"/>
-          <w:sz w:val="22"/>
-          <w:szCs w:val="22"/>
-        </w:rPr>
-        <w:t>Welche Anforderungen müsste ein Lernspiel erfüllen, damit tatsächlich ein Lernerfolg entstehen kann?</w:t>
-      </w:r>
-    </w:p>
-    <w:p>
-      <w:pPr>
-        <w:pStyle w:val="p1"/>
-        <w:spacing w:before="0" w:beforeAutospacing="0" w:after="0" w:afterAutospacing="0" w:line="276" w:lineRule="auto"/>
-        <w:ind w:left="708"/>
-        <w:jc w:val="both"/>
-        <w:rPr>
-          <w:rFonts w:ascii="Verdana" w:hAnsi="Verdana"/>
-          <w:sz w:val="22"/>
-          <w:szCs w:val="22"/>
-        </w:rPr>
-      </w:pPr>
-    </w:p>
-    <w:p>
-      <w:pPr>
-        <w:pStyle w:val="Listenabsatz"/>
-        <w:rPr>
-          <w:rFonts w:ascii="Verdana" w:hAnsi="Verdana"/>
-          <w:sz w:val="22"/>
-          <w:szCs w:val="22"/>
-        </w:rPr>
-      </w:pPr>
+        <w:t xml:space="preserve">Welche </w:t>
+      </w:r>
+      <w:r>
+        <w:rPr>
+          <w:rFonts w:ascii="Verdana" w:hAnsi="Verdana"/>
+          <w:sz w:val="22"/>
+          <w:szCs w:val="22"/>
+        </w:rPr>
+        <w:t>didaktischen, spielerischen oder technischen A</w:t>
+      </w:r>
+      <w:r>
+        <w:rPr>
+          <w:rFonts w:ascii="Verdana" w:hAnsi="Verdana"/>
+          <w:sz w:val="22"/>
+          <w:szCs w:val="22"/>
+        </w:rPr>
+        <w:t xml:space="preserve">nforderungen müsste ein </w:t>
+      </w:r>
+      <w:r>
+        <w:rPr>
+          <w:rFonts w:ascii="Verdana" w:hAnsi="Verdana"/>
+          <w:sz w:val="22"/>
+          <w:szCs w:val="22"/>
+        </w:rPr>
+        <w:t>Serious Game</w:t>
+      </w:r>
+      <w:r>
+        <w:rPr>
+          <w:rFonts w:ascii="Verdana" w:hAnsi="Verdana"/>
+          <w:sz w:val="22"/>
+          <w:szCs w:val="22"/>
+        </w:rPr>
+        <w:t xml:space="preserve"> erfüllen, damit tatsächlich ein Lernerfolg entstehen kann?</w:t>
+      </w:r>
     </w:p>
     <w:sectPr>
       <w:pgSz w:w="11906" w:h="16838"/>

</xml_diff>

<commit_message>
added: Inventory, Ausbesserung Fragebogen
</commit_message>
<xml_diff>
--- a/Arbeit/Interview/Vorbereitung/Durchführung.docx
+++ b/Arbeit/Interview/Vorbereitung/Durchführung.docx
@@ -301,7 +301,79 @@
           <w:sz w:val="22"/>
           <w:szCs w:val="22"/>
         </w:rPr>
-        <w:t>Können Sie kurz beschreiben, welche Rolle Sie derzeit in der Lehre der objektorientierten Programmierung an der HTWK Leipzig einnehmen?</w:t>
+        <w:t>W</w:t>
+      </w:r>
+      <w:r>
+        <w:rPr>
+          <w:rFonts w:ascii="Verdana" w:hAnsi="Verdana"/>
+          <w:sz w:val="22"/>
+          <w:szCs w:val="22"/>
+        </w:rPr>
+        <w:t xml:space="preserve">elche Rolle </w:t>
+      </w:r>
+      <w:r>
+        <w:rPr>
+          <w:rFonts w:ascii="Verdana" w:hAnsi="Verdana"/>
+          <w:sz w:val="22"/>
+          <w:szCs w:val="22"/>
+        </w:rPr>
+        <w:t xml:space="preserve">nehmen </w:t>
+      </w:r>
+      <w:r>
+        <w:rPr>
+          <w:rFonts w:ascii="Verdana" w:hAnsi="Verdana"/>
+          <w:sz w:val="22"/>
+          <w:szCs w:val="22"/>
+        </w:rPr>
+        <w:t xml:space="preserve">Sie derzeit in der Lehre </w:t>
+      </w:r>
+      <w:r>
+        <w:rPr>
+          <w:rFonts w:ascii="Verdana" w:hAnsi="Verdana"/>
+          <w:sz w:val="22"/>
+          <w:szCs w:val="22"/>
+        </w:rPr>
+        <w:t xml:space="preserve">von Programmierung bzw. </w:t>
+      </w:r>
+      <w:r>
+        <w:rPr>
+          <w:rFonts w:ascii="Verdana" w:hAnsi="Verdana"/>
+          <w:sz w:val="22"/>
+          <w:szCs w:val="22"/>
+        </w:rPr>
+        <w:t>objektorientierte</w:t>
+      </w:r>
+      <w:r>
+        <w:rPr>
+          <w:rFonts w:ascii="Verdana" w:hAnsi="Verdana"/>
+          <w:sz w:val="22"/>
+          <w:szCs w:val="22"/>
+        </w:rPr>
+        <w:t>r</w:t>
+      </w:r>
+      <w:r>
+        <w:rPr>
+          <w:rFonts w:ascii="Verdana" w:hAnsi="Verdana"/>
+          <w:sz w:val="22"/>
+          <w:szCs w:val="22"/>
+        </w:rPr>
+        <w:t xml:space="preserve"> Programmierung an der HTWK Leipzig </w:t>
+      </w:r>
+      <w:r>
+        <w:rPr>
+          <w:rFonts w:ascii="Verdana" w:hAnsi="Verdana"/>
+          <w:sz w:val="22"/>
+          <w:szCs w:val="22"/>
+        </w:rPr>
+        <w:t>ein</w:t>
+      </w:r>
+      <w:r>
+        <w:rPr>
+          <w:rFonts w:ascii="Verdana" w:hAnsi="Verdana"/>
+          <w:sz w:val="22"/>
+          <w:szCs w:val="22"/>
+        </w:rPr>
+        <w:t>?</w:t>
       </w:r>
     </w:p>
     <w:p>

</xml_diff>